<commit_message>
Hub docs 52/53/54: UST-17 y UST-18 FIRMADAS (as-built) · UST-19 v2 con doble opt-in y D1–D9 firmados · SIGNED pdf/docx/sha256 en documentation/ust (po256)
</commit_message>
<xml_diff>
--- a/_integration/docs/ust/UST-2026-09-26-17-un-candado-hub-y-startup-admin.docx
+++ b/_integration/docs/ust/UST-2026-09-26-17-un-candado-hub-y-startup-admin.docx
@@ -2149,7 +2149,7 @@
                 <w:sz w:val="16"/>
                 <w:szCs w:val="16"/>
               </w:rPr>
-              <w:t xml:space="preserve"/>
+              <w:t xml:space="preserve">DECIDIDO (Juanjo, 26-sep): la propuesta — Access único reto.</w:t>
             </w:r>
           </w:p>
         </w:tc>
@@ -2263,7 +2263,7 @@
                 <w:sz w:val="16"/>
                 <w:szCs w:val="16"/>
               </w:rPr>
-              <w:t xml:space="preserve"/>
+              <w:t xml:space="preserve">DECIDIDO: 30 días («1 month» en Zero Trust, hecho por Juanjo).</w:t>
             </w:r>
           </w:p>
         </w:tc>
@@ -2377,7 +2377,7 @@
                 <w:sz w:val="16"/>
                 <w:szCs w:val="16"/>
               </w:rPr>
-              <w:t xml:space="preserve"/>
+              <w:t xml:space="preserve">DECIDIDO: la propuesta — «que no se pida excepto si cambia de ordenador o al expirar el token».</w:t>
             </w:r>
           </w:p>
         </w:tc>
@@ -2491,7 +2491,7 @@
                 <w:sz w:val="16"/>
                 <w:szCs w:val="16"/>
               </w:rPr>
-              <w:t xml:space="preserve"/>
+              <w:t xml:space="preserve">DECIDIDO: la propuesta — TOTP opcional, nadie lo pierde.</w:t>
             </w:r>
           </w:p>
         </w:tc>
@@ -2605,7 +2605,7 @@
                 <w:sz w:val="16"/>
                 <w:szCs w:val="16"/>
               </w:rPr>
-              <w:t xml:space="preserve"/>
+              <w:t xml:space="preserve">DECIDIDO: la propuesta — mismo nombre, comentario + test.</w:t>
             </w:r>
           </w:p>
         </w:tc>
@@ -2719,7 +2719,7 @@
                 <w:sz w:val="16"/>
                 <w:szCs w:val="16"/>
               </w:rPr>
-              <w:t xml:space="preserve"/>
+              <w:t xml:space="preserve">DECIDIDO: desviación declarada.</w:t>
             </w:r>
           </w:p>
         </w:tc>
@@ -2833,7 +2833,7 @@
                 <w:sz w:val="16"/>
                 <w:szCs w:val="16"/>
               </w:rPr>
-              <w:t xml:space="preserve"/>
+              <w:t xml:space="preserve">DECIDIDO: carril técnico; corroboración pendiente de Pilar y Lucía.</w:t>
             </w:r>
           </w:p>
         </w:tc>
@@ -3598,7 +3598,7 @@
                 <w:sz w:val="16"/>
                 <w:szCs w:val="16"/>
               </w:rPr>
-              <w:t xml:space="preserve">Carril técnico: decidido por Juanjo en el chat (26-sep, tarde). Firma electrónica simple pendiente (cuando Juanjo lo indique). Pilar y Lucía corroboran en el hub.</w:t>
+              <w:t xml:space="preserve">Carril técnico: decidido por Juanjo en el chat (26-sep, tarde) y FIRMADO esa noche («UST-17 según las recomendaciones también») — firma electrónica simple abajo (huella SHA-256 + marca de tiempo). Pilar y Lucía corroboran en el hub.</w:t>
             </w:r>
           </w:p>
         </w:tc>

</xml_diff>